<commit_message>
feat: add 4 options for stall facia and banner company names with live preview, admin reporting, and Google Sheets sync
</commit_message>
<xml_diff>
--- a/public/STE_EXTRAS_DOCUMENT.docx
+++ b/public/STE_EXTRAS_DOCUMENT.docx
@@ -2997,7 +2997,7 @@
           <w:color w:val="111827"/>
           <w:sz w:val="21"/>
         </w:rPr>
-        <w:t>EXHIBITOR BOOKING DETAILS / ORDER FORM:</w:t>
+        <w:t>EXHIBITOR BOOKING &amp; FASCIA / BANNER DETAILS:</w:t>
       </w:r>
     </w:p>
     <w:tbl>
@@ -3015,8 +3015,8 @@
           <w:tcPr>
             <w:tcW w:type="dxa" w:w="5256"/>
             <w:tcMar>
-              <w:top w:w="80" w:type="dxa"/>
-              <w:bottom w:w="80" w:type="dxa"/>
+              <w:top w:w="70" w:type="dxa"/>
+              <w:bottom w:w="70" w:type="dxa"/>
               <w:left w:w="100" w:type="dxa"/>
               <w:right w:w="100" w:type="dxa"/>
             </w:tcMar>
@@ -3024,7 +3024,7 @@
           <w:p>
             <w:r>
               <w:rPr>
-                <w:sz w:val="18"/>
+                <w:sz w:val="17"/>
               </w:rPr>
               <w:t>Exhibitor Brand Name: _______________________</w:t>
             </w:r>
@@ -3034,8 +3034,8 @@
           <w:tcPr>
             <w:tcW w:type="dxa" w:w="5256"/>
             <w:tcMar>
-              <w:top w:w="80" w:type="dxa"/>
-              <w:bottom w:w="80" w:type="dxa"/>
+              <w:top w:w="70" w:type="dxa"/>
+              <w:bottom w:w="70" w:type="dxa"/>
               <w:left w:w="100" w:type="dxa"/>
               <w:right w:w="100" w:type="dxa"/>
             </w:tcMar>
@@ -3043,7 +3043,7 @@
           <w:p>
             <w:r>
               <w:rPr>
-                <w:sz w:val="18"/>
+                <w:sz w:val="17"/>
               </w:rPr>
               <w:t>Registered Mobile No: _______________________</w:t>
             </w:r>
@@ -3055,8 +3055,8 @@
           <w:tcPr>
             <w:tcW w:type="dxa" w:w="5256"/>
             <w:tcMar>
-              <w:top w:w="80" w:type="dxa"/>
-              <w:bottom w:w="80" w:type="dxa"/>
+              <w:top w:w="70" w:type="dxa"/>
+              <w:bottom w:w="70" w:type="dxa"/>
               <w:left w:w="100" w:type="dxa"/>
               <w:right w:w="100" w:type="dxa"/>
             </w:tcMar>
@@ -3064,7 +3064,7 @@
           <w:p>
             <w:r>
               <w:rPr>
-                <w:sz w:val="18"/>
+                <w:sz w:val="17"/>
               </w:rPr>
               <w:t>Allocated Stall Size (Sq Ft): _________________</w:t>
             </w:r>
@@ -3074,8 +3074,8 @@
           <w:tcPr>
             <w:tcW w:type="dxa" w:w="5256"/>
             <w:tcMar>
-              <w:top w:w="80" w:type="dxa"/>
-              <w:bottom w:w="80" w:type="dxa"/>
+              <w:top w:w="70" w:type="dxa"/>
+              <w:bottom w:w="70" w:type="dxa"/>
               <w:left w:w="100" w:type="dxa"/>
               <w:right w:w="100" w:type="dxa"/>
             </w:tcMar>
@@ -3083,7 +3083,7 @@
           <w:p>
             <w:r>
               <w:rPr>
-                <w:sz w:val="18"/>
+                <w:sz w:val="17"/>
               </w:rPr>
               <w:t>Contact Person Name: _______________________</w:t>
             </w:r>
@@ -3095,8 +3095,8 @@
           <w:tcPr>
             <w:tcW w:type="dxa" w:w="5256"/>
             <w:tcMar>
-              <w:top w:w="80" w:type="dxa"/>
-              <w:bottom w:w="80" w:type="dxa"/>
+              <w:top w:w="70" w:type="dxa"/>
+              <w:bottom w:w="70" w:type="dxa"/>
               <w:left w:w="100" w:type="dxa"/>
               <w:right w:w="100" w:type="dxa"/>
             </w:tcMar>
@@ -3104,9 +3104,9 @@
           <w:p>
             <w:r>
               <w:rPr>
-                <w:sz w:val="18"/>
+                <w:sz w:val="17"/>
               </w:rPr>
-              <w:t>Owner Entry Badges Required: ______________</w:t>
+              <w:t>Fascia Option 1 (Primary): ____________________</w:t>
             </w:r>
           </w:p>
         </w:tc>
@@ -3114,8 +3114,8 @@
           <w:tcPr>
             <w:tcW w:type="dxa" w:w="5256"/>
             <w:tcMar>
-              <w:top w:w="80" w:type="dxa"/>
-              <w:bottom w:w="80" w:type="dxa"/>
+              <w:top w:w="70" w:type="dxa"/>
+              <w:bottom w:w="70" w:type="dxa"/>
               <w:left w:w="100" w:type="dxa"/>
               <w:right w:w="100" w:type="dxa"/>
             </w:tcMar>
@@ -3123,7 +3123,87 @@
           <w:p>
             <w:r>
               <w:rPr>
-                <w:sz w:val="18"/>
+                <w:sz w:val="17"/>
+              </w:rPr>
+              <w:t>Fascia Option 2 (Associate): __________________</w:t>
+            </w:r>
+          </w:p>
+        </w:tc>
+      </w:tr>
+      <w:tr>
+        <w:tc>
+          <w:tcPr>
+            <w:tcW w:type="dxa" w:w="5256"/>
+            <w:tcMar>
+              <w:top w:w="70" w:type="dxa"/>
+              <w:bottom w:w="70" w:type="dxa"/>
+              <w:left w:w="100" w:type="dxa"/>
+              <w:right w:w="100" w:type="dxa"/>
+            </w:tcMar>
+          </w:tcPr>
+          <w:p>
+            <w:r>
+              <w:rPr>
+                <w:sz w:val="17"/>
+              </w:rPr>
+              <w:t>Fascia Option 3 (Group): _____________________</w:t>
+            </w:r>
+          </w:p>
+        </w:tc>
+        <w:tc>
+          <w:tcPr>
+            <w:tcW w:type="dxa" w:w="5256"/>
+            <w:tcMar>
+              <w:top w:w="70" w:type="dxa"/>
+              <w:bottom w:w="70" w:type="dxa"/>
+              <w:left w:w="100" w:type="dxa"/>
+              <w:right w:w="100" w:type="dxa"/>
+            </w:tcMar>
+          </w:tcPr>
+          <w:p>
+            <w:r>
+              <w:rPr>
+                <w:sz w:val="17"/>
+              </w:rPr>
+              <w:t>Fascia Option 4 (Brand): ______________________</w:t>
+            </w:r>
+          </w:p>
+        </w:tc>
+      </w:tr>
+      <w:tr>
+        <w:tc>
+          <w:tcPr>
+            <w:tcW w:type="dxa" w:w="5256"/>
+            <w:tcMar>
+              <w:top w:w="70" w:type="dxa"/>
+              <w:bottom w:w="70" w:type="dxa"/>
+              <w:left w:w="100" w:type="dxa"/>
+              <w:right w:w="100" w:type="dxa"/>
+            </w:tcMar>
+          </w:tcPr>
+          <w:p>
+            <w:r>
+              <w:rPr>
+                <w:sz w:val="17"/>
+              </w:rPr>
+              <w:t>Owner Entry Badges: ________________________</w:t>
+            </w:r>
+          </w:p>
+        </w:tc>
+        <w:tc>
+          <w:tcPr>
+            <w:tcW w:type="dxa" w:w="5256"/>
+            <w:tcMar>
+              <w:top w:w="70" w:type="dxa"/>
+              <w:bottom w:w="70" w:type="dxa"/>
+              <w:left w:w="100" w:type="dxa"/>
+              <w:right w:w="100" w:type="dxa"/>
+            </w:tcMar>
+          </w:tcPr>
+          <w:p>
+            <w:r>
+              <w:rPr>
+                <w:sz w:val="17"/>
               </w:rPr>
               <w:t>Staff Badges Required: ______________________</w:t>
             </w:r>

</xml_diff>

<commit_message>
feat: standardize all 4 fascia options to display Main Header only across portal, admin and docs
</commit_message>
<xml_diff>
--- a/public/STE_EXTRAS_DOCUMENT.docx
+++ b/public/STE_EXTRAS_DOCUMENT.docx
@@ -3106,7 +3106,7 @@
               <w:rPr>
                 <w:sz w:val="17"/>
               </w:rPr>
-              <w:t>Fascia Option 1 (Primary): ____________________</w:t>
+              <w:t>Fascia Main Header (Option 1): ______________</w:t>
             </w:r>
           </w:p>
         </w:tc>
@@ -3125,7 +3125,7 @@
               <w:rPr>
                 <w:sz w:val="17"/>
               </w:rPr>
-              <w:t>Fascia Option 2 (Associate): __________________</w:t>
+              <w:t>Fascia Main Header (Option 2): ______________</w:t>
             </w:r>
           </w:p>
         </w:tc>
@@ -3146,7 +3146,7 @@
               <w:rPr>
                 <w:sz w:val="17"/>
               </w:rPr>
-              <w:t>Fascia Option 3 (Group): _____________________</w:t>
+              <w:t>Fascia Main Header (Option 3): ______________</w:t>
             </w:r>
           </w:p>
         </w:tc>
@@ -3165,7 +3165,7 @@
               <w:rPr>
                 <w:sz w:val="17"/>
               </w:rPr>
-              <w:t>Fascia Option 4 (Brand): ______________________</w:t>
+              <w:t>Fascia Main Header (Option 4): ______________</w:t>
             </w:r>
           </w:p>
         </w:tc>

</xml_diff>

<commit_message>
feat(extras): update extra amenities photos and dimensions from catalog, add receptionist and mannequin photo
</commit_message>
<xml_diff>
--- a/public/STE_EXTRAS_DOCUMENT.docx
+++ b/public/STE_EXTRAS_DOCUMENT.docx
@@ -343,7 +343,7 @@
                 <w:b/>
                 <w:sz w:val="17"/>
               </w:rPr>
-              <w:t>Desk Table</w:t>
+              <w:t>System Table (Desk Table)</w:t>
             </w:r>
           </w:p>
         </w:tc>
@@ -364,7 +364,7 @@
                 <w:color w:val="4B5563"/>
                 <w:sz w:val="16"/>
               </w:rPr>
-              <w:t>1m × 0.5m × 0.75m</w:t>
+              <w:t>1m × 0.5m × 0.75m ht</w:t>
             </w:r>
           </w:p>
         </w:tc>
@@ -486,7 +486,7 @@
                 <w:color w:val="B45309"/>
                 <w:sz w:val="17"/>
               </w:rPr>
-              <w:t>DP 03</w:t>
+              <w:t>DP 02</w:t>
             </w:r>
           </w:p>
         </w:tc>
@@ -507,7 +507,7 @@
                 <w:b/>
                 <w:sz w:val="17"/>
               </w:rPr>
-              <w:t>Glass Round Table</w:t>
+              <w:t>Wooden Table with cover</w:t>
             </w:r>
           </w:p>
         </w:tc>
@@ -528,7 +528,7 @@
                 <w:color w:val="4B5563"/>
                 <w:sz w:val="16"/>
               </w:rPr>
-              <w:t>1m dia × 0.75m</w:t>
+              <w:t>5' × 2.5'</w:t>
             </w:r>
           </w:p>
         </w:tc>
@@ -553,7 +553,7 @@
                 <w:color w:val="111827"/>
                 <w:sz w:val="17"/>
               </w:rPr>
-              <w:t>₹1,400</w:t>
+              <w:t>₹400</w:t>
             </w:r>
           </w:p>
         </w:tc>
@@ -576,7 +576,7 @@
               <w:rPr>
                 <w:sz w:val="16"/>
               </w:rPr>
-              <w:t>$15</w:t>
+              <w:t>$5</w:t>
             </w:r>
           </w:p>
         </w:tc>
@@ -650,7 +650,7 @@
                 <w:color w:val="B45309"/>
                 <w:sz w:val="17"/>
               </w:rPr>
-              <w:t>DP 04</w:t>
+              <w:t>DP 03</w:t>
             </w:r>
           </w:p>
         </w:tc>
@@ -671,7 +671,7 @@
                 <w:b/>
                 <w:sz w:val="17"/>
               </w:rPr>
-              <w:t>White Chair</w:t>
+              <w:t>Glass Round Table</w:t>
             </w:r>
           </w:p>
         </w:tc>
@@ -692,7 +692,335 @@
                 <w:color w:val="4B5563"/>
                 <w:sz w:val="16"/>
               </w:rPr>
+              <w:t>2'8" Ø &amp; 2'6" ht</w:t>
+            </w:r>
+          </w:p>
+        </w:tc>
+        <w:tc>
+          <w:tcPr>
+            <w:tcW w:type="dxa" w:w="1502"/>
+            <w:shd w:fill="F9FAFB"/>
+            <w:tcMar>
+              <w:top w:w="80" w:type="dxa"/>
+              <w:bottom w:w="80" w:type="dxa"/>
+              <w:left w:w="80" w:type="dxa"/>
+              <w:right w:w="80" w:type="dxa"/>
+            </w:tcMar>
+          </w:tcPr>
+          <w:p>
+            <w:pPr>
+              <w:jc w:val="right"/>
+            </w:pPr>
+            <w:r>
+              <w:rPr>
+                <w:b/>
+                <w:color w:val="111827"/>
+                <w:sz w:val="17"/>
+              </w:rPr>
+              <w:t>₹1,400</w:t>
+            </w:r>
+          </w:p>
+        </w:tc>
+        <w:tc>
+          <w:tcPr>
+            <w:tcW w:type="dxa" w:w="1502"/>
+            <w:shd w:fill="F9FAFB"/>
+            <w:tcMar>
+              <w:top w:w="80" w:type="dxa"/>
+              <w:bottom w:w="80" w:type="dxa"/>
+              <w:left w:w="80" w:type="dxa"/>
+              <w:right w:w="80" w:type="dxa"/>
+            </w:tcMar>
+          </w:tcPr>
+          <w:p>
+            <w:pPr>
+              <w:jc w:val="right"/>
+            </w:pPr>
+            <w:r>
+              <w:rPr>
+                <w:sz w:val="16"/>
+              </w:rPr>
+              <w:t>$15</w:t>
+            </w:r>
+          </w:p>
+        </w:tc>
+        <w:tc>
+          <w:tcPr>
+            <w:tcW w:type="dxa" w:w="1502"/>
+            <w:shd w:fill="F9FAFB"/>
+            <w:tcMar>
+              <w:top w:w="80" w:type="dxa"/>
+              <w:bottom w:w="80" w:type="dxa"/>
+              <w:left w:w="80" w:type="dxa"/>
+              <w:right w:w="80" w:type="dxa"/>
+            </w:tcMar>
+          </w:tcPr>
+          <w:p>
+            <w:pPr>
+              <w:jc w:val="center"/>
+            </w:pPr>
+            <w:r>
+              <w:rPr>
+                <w:sz w:val="16"/>
+              </w:rPr>
+              <w:t>Per day</w:t>
+            </w:r>
+          </w:p>
+        </w:tc>
+        <w:tc>
+          <w:tcPr>
+            <w:tcW w:type="dxa" w:w="1502"/>
+            <w:shd w:fill="F9FAFB"/>
+            <w:tcMar>
+              <w:top w:w="80" w:type="dxa"/>
+              <w:bottom w:w="80" w:type="dxa"/>
+              <w:left w:w="80" w:type="dxa"/>
+              <w:right w:w="80" w:type="dxa"/>
+            </w:tcMar>
+          </w:tcPr>
+          <w:p>
+            <w:pPr>
+              <w:jc w:val="center"/>
+            </w:pPr>
+            <w:r>
+              <w:rPr>
+                <w:color w:val="9CA3AF"/>
+                <w:sz w:val="16"/>
+              </w:rPr>
+              <w:t>[   ] Qty</w:t>
+            </w:r>
+          </w:p>
+        </w:tc>
+      </w:tr>
+      <w:tr>
+        <w:tc>
+          <w:tcPr>
+            <w:tcW w:type="dxa" w:w="1502"/>
+            <w:shd w:fill="FFFFFF"/>
+            <w:tcMar>
+              <w:top w:w="80" w:type="dxa"/>
+              <w:bottom w:w="80" w:type="dxa"/>
+              <w:left w:w="80" w:type="dxa"/>
+              <w:right w:w="80" w:type="dxa"/>
+            </w:tcMar>
+          </w:tcPr>
+          <w:p>
+            <w:pPr>
+              <w:jc w:val="center"/>
+            </w:pPr>
+            <w:r>
+              <w:rPr>
+                <w:b/>
+                <w:color w:val="B45309"/>
+                <w:sz w:val="17"/>
+              </w:rPr>
+              <w:t>DP 04</w:t>
+            </w:r>
+          </w:p>
+        </w:tc>
+        <w:tc>
+          <w:tcPr>
+            <w:tcW w:type="dxa" w:w="1502"/>
+            <w:shd w:fill="FFFFFF"/>
+            <w:tcMar>
+              <w:top w:w="80" w:type="dxa"/>
+              <w:bottom w:w="80" w:type="dxa"/>
+              <w:left w:w="80" w:type="dxa"/>
+              <w:right w:w="80" w:type="dxa"/>
+            </w:tcMar>
+          </w:tcPr>
+          <w:p>
+            <w:r>
+              <w:rPr>
+                <w:b/>
+                <w:sz w:val="17"/>
+              </w:rPr>
+              <w:t>Exhibition Chairs (White Chair)</w:t>
+            </w:r>
+          </w:p>
+        </w:tc>
+        <w:tc>
+          <w:tcPr>
+            <w:tcW w:type="dxa" w:w="1502"/>
+            <w:shd w:fill="FFFFFF"/>
+            <w:tcMar>
+              <w:top w:w="80" w:type="dxa"/>
+              <w:bottom w:w="80" w:type="dxa"/>
+              <w:left w:w="80" w:type="dxa"/>
+              <w:right w:w="80" w:type="dxa"/>
+            </w:tcMar>
+          </w:tcPr>
+          <w:p>
+            <w:r>
+              <w:rPr>
+                <w:color w:val="4B5563"/>
+                <w:sz w:val="16"/>
+              </w:rPr>
               <w:t>Standard exhibition seating</w:t>
+            </w:r>
+          </w:p>
+        </w:tc>
+        <w:tc>
+          <w:tcPr>
+            <w:tcW w:type="dxa" w:w="1502"/>
+            <w:shd w:fill="FFFFFF"/>
+            <w:tcMar>
+              <w:top w:w="80" w:type="dxa"/>
+              <w:bottom w:w="80" w:type="dxa"/>
+              <w:left w:w="80" w:type="dxa"/>
+              <w:right w:w="80" w:type="dxa"/>
+            </w:tcMar>
+          </w:tcPr>
+          <w:p>
+            <w:pPr>
+              <w:jc w:val="right"/>
+            </w:pPr>
+            <w:r>
+              <w:rPr>
+                <w:b/>
+                <w:color w:val="111827"/>
+                <w:sz w:val="17"/>
+              </w:rPr>
+              <w:t>₹700</w:t>
+            </w:r>
+          </w:p>
+        </w:tc>
+        <w:tc>
+          <w:tcPr>
+            <w:tcW w:type="dxa" w:w="1502"/>
+            <w:shd w:fill="FFFFFF"/>
+            <w:tcMar>
+              <w:top w:w="80" w:type="dxa"/>
+              <w:bottom w:w="80" w:type="dxa"/>
+              <w:left w:w="80" w:type="dxa"/>
+              <w:right w:w="80" w:type="dxa"/>
+            </w:tcMar>
+          </w:tcPr>
+          <w:p>
+            <w:pPr>
+              <w:jc w:val="right"/>
+            </w:pPr>
+            <w:r>
+              <w:rPr>
+                <w:sz w:val="16"/>
+              </w:rPr>
+              <w:t>$8</w:t>
+            </w:r>
+          </w:p>
+        </w:tc>
+        <w:tc>
+          <w:tcPr>
+            <w:tcW w:type="dxa" w:w="1502"/>
+            <w:shd w:fill="FFFFFF"/>
+            <w:tcMar>
+              <w:top w:w="80" w:type="dxa"/>
+              <w:bottom w:w="80" w:type="dxa"/>
+              <w:left w:w="80" w:type="dxa"/>
+              <w:right w:w="80" w:type="dxa"/>
+            </w:tcMar>
+          </w:tcPr>
+          <w:p>
+            <w:pPr>
+              <w:jc w:val="center"/>
+            </w:pPr>
+            <w:r>
+              <w:rPr>
+                <w:sz w:val="16"/>
+              </w:rPr>
+              <w:t>Per day</w:t>
+            </w:r>
+          </w:p>
+        </w:tc>
+        <w:tc>
+          <w:tcPr>
+            <w:tcW w:type="dxa" w:w="1502"/>
+            <w:shd w:fill="FFFFFF"/>
+            <w:tcMar>
+              <w:top w:w="80" w:type="dxa"/>
+              <w:bottom w:w="80" w:type="dxa"/>
+              <w:left w:w="80" w:type="dxa"/>
+              <w:right w:w="80" w:type="dxa"/>
+            </w:tcMar>
+          </w:tcPr>
+          <w:p>
+            <w:pPr>
+              <w:jc w:val="center"/>
+            </w:pPr>
+            <w:r>
+              <w:rPr>
+                <w:color w:val="9CA3AF"/>
+                <w:sz w:val="16"/>
+              </w:rPr>
+              <w:t>[   ] Qty</w:t>
+            </w:r>
+          </w:p>
+        </w:tc>
+      </w:tr>
+      <w:tr>
+        <w:tc>
+          <w:tcPr>
+            <w:tcW w:type="dxa" w:w="1502"/>
+            <w:shd w:fill="F9FAFB"/>
+            <w:tcMar>
+              <w:top w:w="80" w:type="dxa"/>
+              <w:bottom w:w="80" w:type="dxa"/>
+              <w:left w:w="80" w:type="dxa"/>
+              <w:right w:w="80" w:type="dxa"/>
+            </w:tcMar>
+          </w:tcPr>
+          <w:p>
+            <w:pPr>
+              <w:jc w:val="center"/>
+            </w:pPr>
+            <w:r>
+              <w:rPr>
+                <w:b/>
+                <w:color w:val="B45309"/>
+                <w:sz w:val="17"/>
+              </w:rPr>
+              <w:t>DP 05</w:t>
+            </w:r>
+          </w:p>
+        </w:tc>
+        <w:tc>
+          <w:tcPr>
+            <w:tcW w:type="dxa" w:w="1502"/>
+            <w:shd w:fill="F9FAFB"/>
+            <w:tcMar>
+              <w:top w:w="80" w:type="dxa"/>
+              <w:bottom w:w="80" w:type="dxa"/>
+              <w:left w:w="80" w:type="dxa"/>
+              <w:right w:w="80" w:type="dxa"/>
+            </w:tcMar>
+          </w:tcPr>
+          <w:p>
+            <w:r>
+              <w:rPr>
+                <w:b/>
+                <w:sz w:val="17"/>
+              </w:rPr>
+              <w:t>Stake Chair (Cushioned Chair)</w:t>
+            </w:r>
+          </w:p>
+        </w:tc>
+        <w:tc>
+          <w:tcPr>
+            <w:tcW w:type="dxa" w:w="1502"/>
+            <w:shd w:fill="F9FAFB"/>
+            <w:tcMar>
+              <w:top w:w="80" w:type="dxa"/>
+              <w:bottom w:w="80" w:type="dxa"/>
+              <w:left w:w="80" w:type="dxa"/>
+              <w:right w:w="80" w:type="dxa"/>
+            </w:tcMar>
+          </w:tcPr>
+          <w:p>
+            <w:r>
+              <w:rPr>
+                <w:color w:val="4B5563"/>
+                <w:sz w:val="16"/>
+              </w:rPr>
+              <w:t>Cushioned conference chair</w:t>
             </w:r>
           </w:p>
         </w:tc>
@@ -814,7 +1142,7 @@
                 <w:color w:val="B45309"/>
                 <w:sz w:val="17"/>
               </w:rPr>
-              <w:t>DP 05</w:t>
+              <w:t>DP 06</w:t>
             </w:r>
           </w:p>
         </w:tc>
@@ -835,7 +1163,7 @@
                 <w:b/>
                 <w:sz w:val="17"/>
               </w:rPr>
-              <w:t>Cushioned Chair</w:t>
+              <w:t>Apple Chair</w:t>
             </w:r>
           </w:p>
         </w:tc>
@@ -856,7 +1184,7 @@
                 <w:color w:val="4B5563"/>
                 <w:sz w:val="16"/>
               </w:rPr>
-              <w:t>Comfortable cushioned meeting chair</w:t>
+              <w:t>Modern designer seating</w:t>
             </w:r>
           </w:p>
         </w:tc>
@@ -881,7 +1209,7 @@
                 <w:color w:val="111827"/>
                 <w:sz w:val="17"/>
               </w:rPr>
-              <w:t>₹700</w:t>
+              <w:t>₹500</w:t>
             </w:r>
           </w:p>
         </w:tc>
@@ -904,7 +1232,7 @@
               <w:rPr>
                 <w:sz w:val="16"/>
               </w:rPr>
-              <w:t>$8</w:t>
+              <w:t>$6</w:t>
             </w:r>
           </w:p>
         </w:tc>
@@ -1020,7 +1348,7 @@
                 <w:color w:val="4B5563"/>
                 <w:sz w:val="16"/>
               </w:rPr>
-              <w:t>Plush leather armchair</w:t>
+              <w:t>Plush armchair</w:t>
             </w:r>
           </w:p>
         </w:tc>
@@ -1163,7 +1491,7 @@
                 <w:b/>
                 <w:sz w:val="17"/>
               </w:rPr>
-              <w:t>Sofa Double Seat</w:t>
+              <w:t>2 Seater Sofa (Sofa Double Seat)</w:t>
             </w:r>
           </w:p>
         </w:tc>
@@ -1327,7 +1655,7 @@
                 <w:b/>
                 <w:sz w:val="17"/>
               </w:rPr>
-              <w:t>Sofa Three Seat</w:t>
+              <w:t>3 Seater Sofa (Sofa Three Seat)</w:t>
             </w:r>
           </w:p>
         </w:tc>
@@ -1491,7 +1819,7 @@
                 <w:b/>
                 <w:sz w:val="17"/>
               </w:rPr>
-              <w:t>Glass Centre Table</w:t>
+              <w:t>Rectangle Tipoi (Glass Centre Table)</w:t>
             </w:r>
           </w:p>
         </w:tc>
@@ -1634,6 +1962,662 @@
                 <w:color w:val="B45309"/>
                 <w:sz w:val="17"/>
               </w:rPr>
+              <w:t>DP 12</w:t>
+            </w:r>
+          </w:p>
+        </w:tc>
+        <w:tc>
+          <w:tcPr>
+            <w:tcW w:type="dxa" w:w="1502"/>
+            <w:shd w:fill="F9FAFB"/>
+            <w:tcMar>
+              <w:top w:w="80" w:type="dxa"/>
+              <w:bottom w:w="80" w:type="dxa"/>
+              <w:left w:w="80" w:type="dxa"/>
+              <w:right w:w="80" w:type="dxa"/>
+            </w:tcMar>
+          </w:tcPr>
+          <w:p>
+            <w:r>
+              <w:rPr>
+                <w:b/>
+                <w:sz w:val="17"/>
+              </w:rPr>
+              <w:t>Display Glass Counter (Without Lock)</w:t>
+            </w:r>
+          </w:p>
+        </w:tc>
+        <w:tc>
+          <w:tcPr>
+            <w:tcW w:type="dxa" w:w="1502"/>
+            <w:shd w:fill="F9FAFB"/>
+            <w:tcMar>
+              <w:top w:w="80" w:type="dxa"/>
+              <w:bottom w:w="80" w:type="dxa"/>
+              <w:left w:w="80" w:type="dxa"/>
+              <w:right w:w="80" w:type="dxa"/>
+            </w:tcMar>
+          </w:tcPr>
+          <w:p>
+            <w:r>
+              <w:rPr>
+                <w:color w:val="4B5563"/>
+                <w:sz w:val="16"/>
+              </w:rPr>
+              <w:t>37.50" × 18" × 39" ht (no light)</w:t>
+            </w:r>
+          </w:p>
+        </w:tc>
+        <w:tc>
+          <w:tcPr>
+            <w:tcW w:type="dxa" w:w="1502"/>
+            <w:shd w:fill="F9FAFB"/>
+            <w:tcMar>
+              <w:top w:w="80" w:type="dxa"/>
+              <w:bottom w:w="80" w:type="dxa"/>
+              <w:left w:w="80" w:type="dxa"/>
+              <w:right w:w="80" w:type="dxa"/>
+            </w:tcMar>
+          </w:tcPr>
+          <w:p>
+            <w:pPr>
+              <w:jc w:val="right"/>
+            </w:pPr>
+            <w:r>
+              <w:rPr>
+                <w:b/>
+                <w:color w:val="111827"/>
+                <w:sz w:val="17"/>
+              </w:rPr>
+              <w:t>₹2,500</w:t>
+            </w:r>
+          </w:p>
+        </w:tc>
+        <w:tc>
+          <w:tcPr>
+            <w:tcW w:type="dxa" w:w="1502"/>
+            <w:shd w:fill="F9FAFB"/>
+            <w:tcMar>
+              <w:top w:w="80" w:type="dxa"/>
+              <w:bottom w:w="80" w:type="dxa"/>
+              <w:left w:w="80" w:type="dxa"/>
+              <w:right w:w="80" w:type="dxa"/>
+            </w:tcMar>
+          </w:tcPr>
+          <w:p>
+            <w:pPr>
+              <w:jc w:val="right"/>
+            </w:pPr>
+            <w:r>
+              <w:rPr>
+                <w:sz w:val="16"/>
+              </w:rPr>
+              <w:t>$28</w:t>
+            </w:r>
+          </w:p>
+        </w:tc>
+        <w:tc>
+          <w:tcPr>
+            <w:tcW w:type="dxa" w:w="1502"/>
+            <w:shd w:fill="F9FAFB"/>
+            <w:tcMar>
+              <w:top w:w="80" w:type="dxa"/>
+              <w:bottom w:w="80" w:type="dxa"/>
+              <w:left w:w="80" w:type="dxa"/>
+              <w:right w:w="80" w:type="dxa"/>
+            </w:tcMar>
+          </w:tcPr>
+          <w:p>
+            <w:pPr>
+              <w:jc w:val="center"/>
+            </w:pPr>
+            <w:r>
+              <w:rPr>
+                <w:sz w:val="16"/>
+              </w:rPr>
+              <w:t>Per day</w:t>
+            </w:r>
+          </w:p>
+        </w:tc>
+        <w:tc>
+          <w:tcPr>
+            <w:tcW w:type="dxa" w:w="1502"/>
+            <w:shd w:fill="F9FAFB"/>
+            <w:tcMar>
+              <w:top w:w="80" w:type="dxa"/>
+              <w:bottom w:w="80" w:type="dxa"/>
+              <w:left w:w="80" w:type="dxa"/>
+              <w:right w:w="80" w:type="dxa"/>
+            </w:tcMar>
+          </w:tcPr>
+          <w:p>
+            <w:pPr>
+              <w:jc w:val="center"/>
+            </w:pPr>
+            <w:r>
+              <w:rPr>
+                <w:color w:val="9CA3AF"/>
+                <w:sz w:val="16"/>
+              </w:rPr>
+              <w:t>[   ] Qty</w:t>
+            </w:r>
+          </w:p>
+        </w:tc>
+      </w:tr>
+      <w:tr>
+        <w:tc>
+          <w:tcPr>
+            <w:tcW w:type="dxa" w:w="1502"/>
+            <w:shd w:fill="FFFFFF"/>
+            <w:tcMar>
+              <w:top w:w="80" w:type="dxa"/>
+              <w:bottom w:w="80" w:type="dxa"/>
+              <w:left w:w="80" w:type="dxa"/>
+              <w:right w:w="80" w:type="dxa"/>
+            </w:tcMar>
+          </w:tcPr>
+          <w:p>
+            <w:pPr>
+              <w:jc w:val="center"/>
+            </w:pPr>
+            <w:r>
+              <w:rPr>
+                <w:b/>
+                <w:color w:val="B45309"/>
+                <w:sz w:val="17"/>
+              </w:rPr>
+              <w:t>DP 13</w:t>
+            </w:r>
+          </w:p>
+        </w:tc>
+        <w:tc>
+          <w:tcPr>
+            <w:tcW w:type="dxa" w:w="1502"/>
+            <w:shd w:fill="FFFFFF"/>
+            <w:tcMar>
+              <w:top w:w="80" w:type="dxa"/>
+              <w:bottom w:w="80" w:type="dxa"/>
+              <w:left w:w="80" w:type="dxa"/>
+              <w:right w:w="80" w:type="dxa"/>
+            </w:tcMar>
+          </w:tcPr>
+          <w:p>
+            <w:r>
+              <w:rPr>
+                <w:b/>
+                <w:sz w:val="17"/>
+              </w:rPr>
+              <w:t>Display Glass Counter (With Lock)</w:t>
+            </w:r>
+          </w:p>
+        </w:tc>
+        <w:tc>
+          <w:tcPr>
+            <w:tcW w:type="dxa" w:w="1502"/>
+            <w:shd w:fill="FFFFFF"/>
+            <w:tcMar>
+              <w:top w:w="80" w:type="dxa"/>
+              <w:bottom w:w="80" w:type="dxa"/>
+              <w:left w:w="80" w:type="dxa"/>
+              <w:right w:w="80" w:type="dxa"/>
+            </w:tcMar>
+          </w:tcPr>
+          <w:p>
+            <w:r>
+              <w:rPr>
+                <w:color w:val="4B5563"/>
+                <w:sz w:val="16"/>
+              </w:rPr>
+              <w:t>37.50" × 18" × 39" ht (no light)</w:t>
+            </w:r>
+          </w:p>
+        </w:tc>
+        <w:tc>
+          <w:tcPr>
+            <w:tcW w:type="dxa" w:w="1502"/>
+            <w:shd w:fill="FFFFFF"/>
+            <w:tcMar>
+              <w:top w:w="80" w:type="dxa"/>
+              <w:bottom w:w="80" w:type="dxa"/>
+              <w:left w:w="80" w:type="dxa"/>
+              <w:right w:w="80" w:type="dxa"/>
+            </w:tcMar>
+          </w:tcPr>
+          <w:p>
+            <w:pPr>
+              <w:jc w:val="right"/>
+            </w:pPr>
+            <w:r>
+              <w:rPr>
+                <w:b/>
+                <w:color w:val="111827"/>
+                <w:sz w:val="17"/>
+              </w:rPr>
+              <w:t>₹3,000</w:t>
+            </w:r>
+          </w:p>
+        </w:tc>
+        <w:tc>
+          <w:tcPr>
+            <w:tcW w:type="dxa" w:w="1502"/>
+            <w:shd w:fill="FFFFFF"/>
+            <w:tcMar>
+              <w:top w:w="80" w:type="dxa"/>
+              <w:bottom w:w="80" w:type="dxa"/>
+              <w:left w:w="80" w:type="dxa"/>
+              <w:right w:w="80" w:type="dxa"/>
+            </w:tcMar>
+          </w:tcPr>
+          <w:p>
+            <w:pPr>
+              <w:jc w:val="right"/>
+            </w:pPr>
+            <w:r>
+              <w:rPr>
+                <w:sz w:val="16"/>
+              </w:rPr>
+              <w:t>$33</w:t>
+            </w:r>
+          </w:p>
+        </w:tc>
+        <w:tc>
+          <w:tcPr>
+            <w:tcW w:type="dxa" w:w="1502"/>
+            <w:shd w:fill="FFFFFF"/>
+            <w:tcMar>
+              <w:top w:w="80" w:type="dxa"/>
+              <w:bottom w:w="80" w:type="dxa"/>
+              <w:left w:w="80" w:type="dxa"/>
+              <w:right w:w="80" w:type="dxa"/>
+            </w:tcMar>
+          </w:tcPr>
+          <w:p>
+            <w:pPr>
+              <w:jc w:val="center"/>
+            </w:pPr>
+            <w:r>
+              <w:rPr>
+                <w:sz w:val="16"/>
+              </w:rPr>
+              <w:t>Per day</w:t>
+            </w:r>
+          </w:p>
+        </w:tc>
+        <w:tc>
+          <w:tcPr>
+            <w:tcW w:type="dxa" w:w="1502"/>
+            <w:shd w:fill="FFFFFF"/>
+            <w:tcMar>
+              <w:top w:w="80" w:type="dxa"/>
+              <w:bottom w:w="80" w:type="dxa"/>
+              <w:left w:w="80" w:type="dxa"/>
+              <w:right w:w="80" w:type="dxa"/>
+            </w:tcMar>
+          </w:tcPr>
+          <w:p>
+            <w:pPr>
+              <w:jc w:val="center"/>
+            </w:pPr>
+            <w:r>
+              <w:rPr>
+                <w:color w:val="9CA3AF"/>
+                <w:sz w:val="16"/>
+              </w:rPr>
+              <w:t>[   ] Qty</w:t>
+            </w:r>
+          </w:p>
+        </w:tc>
+      </w:tr>
+      <w:tr>
+        <w:tc>
+          <w:tcPr>
+            <w:tcW w:type="dxa" w:w="1502"/>
+            <w:shd w:fill="F9FAFB"/>
+            <w:tcMar>
+              <w:top w:w="80" w:type="dxa"/>
+              <w:bottom w:w="80" w:type="dxa"/>
+              <w:left w:w="80" w:type="dxa"/>
+              <w:right w:w="80" w:type="dxa"/>
+            </w:tcMar>
+          </w:tcPr>
+          <w:p>
+            <w:pPr>
+              <w:jc w:val="center"/>
+            </w:pPr>
+            <w:r>
+              <w:rPr>
+                <w:b/>
+                <w:color w:val="B45309"/>
+                <w:sz w:val="17"/>
+              </w:rPr>
+              <w:t>DP 14</w:t>
+            </w:r>
+          </w:p>
+        </w:tc>
+        <w:tc>
+          <w:tcPr>
+            <w:tcW w:type="dxa" w:w="1502"/>
+            <w:shd w:fill="F9FAFB"/>
+            <w:tcMar>
+              <w:top w:w="80" w:type="dxa"/>
+              <w:bottom w:w="80" w:type="dxa"/>
+              <w:left w:w="80" w:type="dxa"/>
+              <w:right w:w="80" w:type="dxa"/>
+            </w:tcMar>
+          </w:tcPr>
+          <w:p>
+            <w:r>
+              <w:rPr>
+                <w:b/>
+                <w:sz w:val="17"/>
+              </w:rPr>
+              <w:t>Tall Showcase (Without Lock)</w:t>
+            </w:r>
+          </w:p>
+        </w:tc>
+        <w:tc>
+          <w:tcPr>
+            <w:tcW w:type="dxa" w:w="1502"/>
+            <w:shd w:fill="F9FAFB"/>
+            <w:tcMar>
+              <w:top w:w="80" w:type="dxa"/>
+              <w:bottom w:w="80" w:type="dxa"/>
+              <w:left w:w="80" w:type="dxa"/>
+              <w:right w:w="80" w:type="dxa"/>
+            </w:tcMar>
+          </w:tcPr>
+          <w:p>
+            <w:r>
+              <w:rPr>
+                <w:color w:val="4B5563"/>
+                <w:sz w:val="16"/>
+              </w:rPr>
+              <w:t>37.50" × 18" × 84" ht (no light)</w:t>
+            </w:r>
+          </w:p>
+        </w:tc>
+        <w:tc>
+          <w:tcPr>
+            <w:tcW w:type="dxa" w:w="1502"/>
+            <w:shd w:fill="F9FAFB"/>
+            <w:tcMar>
+              <w:top w:w="80" w:type="dxa"/>
+              <w:bottom w:w="80" w:type="dxa"/>
+              <w:left w:w="80" w:type="dxa"/>
+              <w:right w:w="80" w:type="dxa"/>
+            </w:tcMar>
+          </w:tcPr>
+          <w:p>
+            <w:pPr>
+              <w:jc w:val="right"/>
+            </w:pPr>
+            <w:r>
+              <w:rPr>
+                <w:b/>
+                <w:color w:val="111827"/>
+                <w:sz w:val="17"/>
+              </w:rPr>
+              <w:t>₹4,000</w:t>
+            </w:r>
+          </w:p>
+        </w:tc>
+        <w:tc>
+          <w:tcPr>
+            <w:tcW w:type="dxa" w:w="1502"/>
+            <w:shd w:fill="F9FAFB"/>
+            <w:tcMar>
+              <w:top w:w="80" w:type="dxa"/>
+              <w:bottom w:w="80" w:type="dxa"/>
+              <w:left w:w="80" w:type="dxa"/>
+              <w:right w:w="80" w:type="dxa"/>
+            </w:tcMar>
+          </w:tcPr>
+          <w:p>
+            <w:pPr>
+              <w:jc w:val="right"/>
+            </w:pPr>
+            <w:r>
+              <w:rPr>
+                <w:sz w:val="16"/>
+              </w:rPr>
+              <w:t>$44</w:t>
+            </w:r>
+          </w:p>
+        </w:tc>
+        <w:tc>
+          <w:tcPr>
+            <w:tcW w:type="dxa" w:w="1502"/>
+            <w:shd w:fill="F9FAFB"/>
+            <w:tcMar>
+              <w:top w:w="80" w:type="dxa"/>
+              <w:bottom w:w="80" w:type="dxa"/>
+              <w:left w:w="80" w:type="dxa"/>
+              <w:right w:w="80" w:type="dxa"/>
+            </w:tcMar>
+          </w:tcPr>
+          <w:p>
+            <w:pPr>
+              <w:jc w:val="center"/>
+            </w:pPr>
+            <w:r>
+              <w:rPr>
+                <w:sz w:val="16"/>
+              </w:rPr>
+              <w:t>Per day</w:t>
+            </w:r>
+          </w:p>
+        </w:tc>
+        <w:tc>
+          <w:tcPr>
+            <w:tcW w:type="dxa" w:w="1502"/>
+            <w:shd w:fill="F9FAFB"/>
+            <w:tcMar>
+              <w:top w:w="80" w:type="dxa"/>
+              <w:bottom w:w="80" w:type="dxa"/>
+              <w:left w:w="80" w:type="dxa"/>
+              <w:right w:w="80" w:type="dxa"/>
+            </w:tcMar>
+          </w:tcPr>
+          <w:p>
+            <w:pPr>
+              <w:jc w:val="center"/>
+            </w:pPr>
+            <w:r>
+              <w:rPr>
+                <w:color w:val="9CA3AF"/>
+                <w:sz w:val="16"/>
+              </w:rPr>
+              <w:t>[   ] Qty</w:t>
+            </w:r>
+          </w:p>
+        </w:tc>
+      </w:tr>
+      <w:tr>
+        <w:tc>
+          <w:tcPr>
+            <w:tcW w:type="dxa" w:w="1502"/>
+            <w:shd w:fill="FFFFFF"/>
+            <w:tcMar>
+              <w:top w:w="80" w:type="dxa"/>
+              <w:bottom w:w="80" w:type="dxa"/>
+              <w:left w:w="80" w:type="dxa"/>
+              <w:right w:w="80" w:type="dxa"/>
+            </w:tcMar>
+          </w:tcPr>
+          <w:p>
+            <w:pPr>
+              <w:jc w:val="center"/>
+            </w:pPr>
+            <w:r>
+              <w:rPr>
+                <w:b/>
+                <w:color w:val="B45309"/>
+                <w:sz w:val="17"/>
+              </w:rPr>
+              <w:t>DP 14A</w:t>
+            </w:r>
+          </w:p>
+        </w:tc>
+        <w:tc>
+          <w:tcPr>
+            <w:tcW w:type="dxa" w:w="1502"/>
+            <w:shd w:fill="FFFFFF"/>
+            <w:tcMar>
+              <w:top w:w="80" w:type="dxa"/>
+              <w:bottom w:w="80" w:type="dxa"/>
+              <w:left w:w="80" w:type="dxa"/>
+              <w:right w:w="80" w:type="dxa"/>
+            </w:tcMar>
+          </w:tcPr>
+          <w:p>
+            <w:r>
+              <w:rPr>
+                <w:b/>
+                <w:sz w:val="17"/>
+              </w:rPr>
+              <w:t>Tall Showcase (With Lock)</w:t>
+            </w:r>
+          </w:p>
+        </w:tc>
+        <w:tc>
+          <w:tcPr>
+            <w:tcW w:type="dxa" w:w="1502"/>
+            <w:shd w:fill="FFFFFF"/>
+            <w:tcMar>
+              <w:top w:w="80" w:type="dxa"/>
+              <w:bottom w:w="80" w:type="dxa"/>
+              <w:left w:w="80" w:type="dxa"/>
+              <w:right w:w="80" w:type="dxa"/>
+            </w:tcMar>
+          </w:tcPr>
+          <w:p>
+            <w:r>
+              <w:rPr>
+                <w:color w:val="4B5563"/>
+                <w:sz w:val="16"/>
+              </w:rPr>
+              <w:t>37.50" × 18" × 84" ht (no light)</w:t>
+            </w:r>
+          </w:p>
+        </w:tc>
+        <w:tc>
+          <w:tcPr>
+            <w:tcW w:type="dxa" w:w="1502"/>
+            <w:shd w:fill="FFFFFF"/>
+            <w:tcMar>
+              <w:top w:w="80" w:type="dxa"/>
+              <w:bottom w:w="80" w:type="dxa"/>
+              <w:left w:w="80" w:type="dxa"/>
+              <w:right w:w="80" w:type="dxa"/>
+            </w:tcMar>
+          </w:tcPr>
+          <w:p>
+            <w:pPr>
+              <w:jc w:val="right"/>
+            </w:pPr>
+            <w:r>
+              <w:rPr>
+                <w:b/>
+                <w:color w:val="111827"/>
+                <w:sz w:val="17"/>
+              </w:rPr>
+              <w:t>₹5,000</w:t>
+            </w:r>
+          </w:p>
+        </w:tc>
+        <w:tc>
+          <w:tcPr>
+            <w:tcW w:type="dxa" w:w="1502"/>
+            <w:shd w:fill="FFFFFF"/>
+            <w:tcMar>
+              <w:top w:w="80" w:type="dxa"/>
+              <w:bottom w:w="80" w:type="dxa"/>
+              <w:left w:w="80" w:type="dxa"/>
+              <w:right w:w="80" w:type="dxa"/>
+            </w:tcMar>
+          </w:tcPr>
+          <w:p>
+            <w:pPr>
+              <w:jc w:val="right"/>
+            </w:pPr>
+            <w:r>
+              <w:rPr>
+                <w:sz w:val="16"/>
+              </w:rPr>
+              <w:t>$55</w:t>
+            </w:r>
+          </w:p>
+        </w:tc>
+        <w:tc>
+          <w:tcPr>
+            <w:tcW w:type="dxa" w:w="1502"/>
+            <w:shd w:fill="FFFFFF"/>
+            <w:tcMar>
+              <w:top w:w="80" w:type="dxa"/>
+              <w:bottom w:w="80" w:type="dxa"/>
+              <w:left w:w="80" w:type="dxa"/>
+              <w:right w:w="80" w:type="dxa"/>
+            </w:tcMar>
+          </w:tcPr>
+          <w:p>
+            <w:pPr>
+              <w:jc w:val="center"/>
+            </w:pPr>
+            <w:r>
+              <w:rPr>
+                <w:sz w:val="16"/>
+              </w:rPr>
+              <w:t>Per day</w:t>
+            </w:r>
+          </w:p>
+        </w:tc>
+        <w:tc>
+          <w:tcPr>
+            <w:tcW w:type="dxa" w:w="1502"/>
+            <w:shd w:fill="FFFFFF"/>
+            <w:tcMar>
+              <w:top w:w="80" w:type="dxa"/>
+              <w:bottom w:w="80" w:type="dxa"/>
+              <w:left w:w="80" w:type="dxa"/>
+              <w:right w:w="80" w:type="dxa"/>
+            </w:tcMar>
+          </w:tcPr>
+          <w:p>
+            <w:pPr>
+              <w:jc w:val="center"/>
+            </w:pPr>
+            <w:r>
+              <w:rPr>
+                <w:color w:val="9CA3AF"/>
+                <w:sz w:val="16"/>
+              </w:rPr>
+              <w:t>[   ] Qty</w:t>
+            </w:r>
+          </w:p>
+        </w:tc>
+      </w:tr>
+      <w:tr>
+        <w:tc>
+          <w:tcPr>
+            <w:tcW w:type="dxa" w:w="1502"/>
+            <w:shd w:fill="F9FAFB"/>
+            <w:tcMar>
+              <w:top w:w="80" w:type="dxa"/>
+              <w:bottom w:w="80" w:type="dxa"/>
+              <w:left w:w="80" w:type="dxa"/>
+              <w:right w:w="80" w:type="dxa"/>
+            </w:tcMar>
+          </w:tcPr>
+          <w:p>
+            <w:pPr>
+              <w:jc w:val="center"/>
+            </w:pPr>
+            <w:r>
+              <w:rPr>
+                <w:b/>
+                <w:color w:val="B45309"/>
+                <w:sz w:val="17"/>
+              </w:rPr>
               <w:t>DP 15</w:t>
             </w:r>
           </w:p>
@@ -1655,7 +2639,7 @@
                 <w:b/>
                 <w:sz w:val="17"/>
               </w:rPr>
-              <w:t>Brochure Rack</w:t>
+              <w:t>Brochure Stand (Brochure Rack)</w:t>
             </w:r>
           </w:p>
         </w:tc>
@@ -1676,7 +2660,7 @@
                 <w:color w:val="4B5563"/>
                 <w:sz w:val="16"/>
               </w:rPr>
-              <w:t>Acrylic / metal catalogue stand</w:t>
+              <w:t>Folding catalogue display stand</w:t>
             </w:r>
           </w:p>
         </w:tc>
@@ -2004,7 +2988,7 @@
                 <w:color w:val="4B5563"/>
                 <w:sz w:val="16"/>
               </w:rPr>
-              <w:t>1m × 0.25m wall shelf</w:t>
+              <w:t>1m × 10"</w:t>
             </w:r>
           </w:p>
         </w:tc>
@@ -2803,7 +3787,7 @@
                 <w:b/>
                 <w:sz w:val="17"/>
               </w:rPr>
-              <w:t>Garment Stand</w:t>
+              <w:t>Garment Stand (Single Rod)</w:t>
             </w:r>
           </w:p>
         </w:tc>
@@ -2824,7 +3808,7 @@
                 <w:color w:val="4B5563"/>
                 <w:sz w:val="16"/>
               </w:rPr>
-              <w:t>Display rack for fabric/garment hangers</w:t>
+              <w:t>4.5'w × 5.5'ht</w:t>
             </w:r>
           </w:p>
         </w:tc>
@@ -2903,6 +3887,498 @@
           <w:tcPr>
             <w:tcW w:type="dxa" w:w="1502"/>
             <w:shd w:fill="FFFFFF"/>
+            <w:tcMar>
+              <w:top w:w="80" w:type="dxa"/>
+              <w:bottom w:w="80" w:type="dxa"/>
+              <w:left w:w="80" w:type="dxa"/>
+              <w:right w:w="80" w:type="dxa"/>
+            </w:tcMar>
+          </w:tcPr>
+          <w:p>
+            <w:pPr>
+              <w:jc w:val="center"/>
+            </w:pPr>
+            <w:r>
+              <w:rPr>
+                <w:color w:val="9CA3AF"/>
+                <w:sz w:val="16"/>
+              </w:rPr>
+              <w:t>[   ] Qty</w:t>
+            </w:r>
+          </w:p>
+        </w:tc>
+      </w:tr>
+      <w:tr>
+        <w:tc>
+          <w:tcPr>
+            <w:tcW w:type="dxa" w:w="1502"/>
+            <w:shd w:fill="F9FAFB"/>
+            <w:tcMar>
+              <w:top w:w="80" w:type="dxa"/>
+              <w:bottom w:w="80" w:type="dxa"/>
+              <w:left w:w="80" w:type="dxa"/>
+              <w:right w:w="80" w:type="dxa"/>
+            </w:tcMar>
+          </w:tcPr>
+          <w:p>
+            <w:pPr>
+              <w:jc w:val="center"/>
+            </w:pPr>
+            <w:r>
+              <w:rPr>
+                <w:b/>
+                <w:color w:val="B45309"/>
+                <w:sz w:val="17"/>
+              </w:rPr>
+              <w:t>DP 27A</w:t>
+            </w:r>
+          </w:p>
+        </w:tc>
+        <w:tc>
+          <w:tcPr>
+            <w:tcW w:type="dxa" w:w="1502"/>
+            <w:shd w:fill="F9FAFB"/>
+            <w:tcMar>
+              <w:top w:w="80" w:type="dxa"/>
+              <w:bottom w:w="80" w:type="dxa"/>
+              <w:left w:w="80" w:type="dxa"/>
+              <w:right w:w="80" w:type="dxa"/>
+            </w:tcMar>
+          </w:tcPr>
+          <w:p>
+            <w:r>
+              <w:rPr>
+                <w:b/>
+                <w:sz w:val="17"/>
+              </w:rPr>
+              <w:t>Garment Stand (Double Rod)</w:t>
+            </w:r>
+          </w:p>
+        </w:tc>
+        <w:tc>
+          <w:tcPr>
+            <w:tcW w:type="dxa" w:w="1502"/>
+            <w:shd w:fill="F9FAFB"/>
+            <w:tcMar>
+              <w:top w:w="80" w:type="dxa"/>
+              <w:bottom w:w="80" w:type="dxa"/>
+              <w:left w:w="80" w:type="dxa"/>
+              <w:right w:w="80" w:type="dxa"/>
+            </w:tcMar>
+          </w:tcPr>
+          <w:p>
+            <w:r>
+              <w:rPr>
+                <w:color w:val="4B5563"/>
+                <w:sz w:val="16"/>
+              </w:rPr>
+              <w:t>4.5'w × 5.5'ht</w:t>
+            </w:r>
+          </w:p>
+        </w:tc>
+        <w:tc>
+          <w:tcPr>
+            <w:tcW w:type="dxa" w:w="1502"/>
+            <w:shd w:fill="F9FAFB"/>
+            <w:tcMar>
+              <w:top w:w="80" w:type="dxa"/>
+              <w:bottom w:w="80" w:type="dxa"/>
+              <w:left w:w="80" w:type="dxa"/>
+              <w:right w:w="80" w:type="dxa"/>
+            </w:tcMar>
+          </w:tcPr>
+          <w:p>
+            <w:pPr>
+              <w:jc w:val="right"/>
+            </w:pPr>
+            <w:r>
+              <w:rPr>
+                <w:b/>
+                <w:color w:val="111827"/>
+                <w:sz w:val="17"/>
+              </w:rPr>
+              <w:t>₹900</w:t>
+            </w:r>
+          </w:p>
+        </w:tc>
+        <w:tc>
+          <w:tcPr>
+            <w:tcW w:type="dxa" w:w="1502"/>
+            <w:shd w:fill="F9FAFB"/>
+            <w:tcMar>
+              <w:top w:w="80" w:type="dxa"/>
+              <w:bottom w:w="80" w:type="dxa"/>
+              <w:left w:w="80" w:type="dxa"/>
+              <w:right w:w="80" w:type="dxa"/>
+            </w:tcMar>
+          </w:tcPr>
+          <w:p>
+            <w:pPr>
+              <w:jc w:val="right"/>
+            </w:pPr>
+            <w:r>
+              <w:rPr>
+                <w:sz w:val="16"/>
+              </w:rPr>
+              <w:t>$7</w:t>
+            </w:r>
+          </w:p>
+        </w:tc>
+        <w:tc>
+          <w:tcPr>
+            <w:tcW w:type="dxa" w:w="1502"/>
+            <w:shd w:fill="F9FAFB"/>
+            <w:tcMar>
+              <w:top w:w="80" w:type="dxa"/>
+              <w:bottom w:w="80" w:type="dxa"/>
+              <w:left w:w="80" w:type="dxa"/>
+              <w:right w:w="80" w:type="dxa"/>
+            </w:tcMar>
+          </w:tcPr>
+          <w:p>
+            <w:pPr>
+              <w:jc w:val="center"/>
+            </w:pPr>
+            <w:r>
+              <w:rPr>
+                <w:sz w:val="16"/>
+              </w:rPr>
+              <w:t>Per day</w:t>
+            </w:r>
+          </w:p>
+        </w:tc>
+        <w:tc>
+          <w:tcPr>
+            <w:tcW w:type="dxa" w:w="1502"/>
+            <w:shd w:fill="F9FAFB"/>
+            <w:tcMar>
+              <w:top w:w="80" w:type="dxa"/>
+              <w:bottom w:w="80" w:type="dxa"/>
+              <w:left w:w="80" w:type="dxa"/>
+              <w:right w:w="80" w:type="dxa"/>
+            </w:tcMar>
+          </w:tcPr>
+          <w:p>
+            <w:pPr>
+              <w:jc w:val="center"/>
+            </w:pPr>
+            <w:r>
+              <w:rPr>
+                <w:color w:val="9CA3AF"/>
+                <w:sz w:val="16"/>
+              </w:rPr>
+              <w:t>[   ] Qty</w:t>
+            </w:r>
+          </w:p>
+        </w:tc>
+      </w:tr>
+      <w:tr>
+        <w:tc>
+          <w:tcPr>
+            <w:tcW w:type="dxa" w:w="1502"/>
+            <w:shd w:fill="FFFFFF"/>
+            <w:tcMar>
+              <w:top w:w="80" w:type="dxa"/>
+              <w:bottom w:w="80" w:type="dxa"/>
+              <w:left w:w="80" w:type="dxa"/>
+              <w:right w:w="80" w:type="dxa"/>
+            </w:tcMar>
+          </w:tcPr>
+          <w:p>
+            <w:pPr>
+              <w:jc w:val="center"/>
+            </w:pPr>
+            <w:r>
+              <w:rPr>
+                <w:b/>
+                <w:color w:val="B45309"/>
+                <w:sz w:val="17"/>
+              </w:rPr>
+              <w:t>DP 28</w:t>
+            </w:r>
+          </w:p>
+        </w:tc>
+        <w:tc>
+          <w:tcPr>
+            <w:tcW w:type="dxa" w:w="1502"/>
+            <w:shd w:fill="FFFFFF"/>
+            <w:tcMar>
+              <w:top w:w="80" w:type="dxa"/>
+              <w:bottom w:w="80" w:type="dxa"/>
+              <w:left w:w="80" w:type="dxa"/>
+              <w:right w:w="80" w:type="dxa"/>
+            </w:tcMar>
+          </w:tcPr>
+          <w:p>
+            <w:r>
+              <w:rPr>
+                <w:b/>
+                <w:sz w:val="17"/>
+              </w:rPr>
+              <w:t>Mannequin</w:t>
+            </w:r>
+          </w:p>
+        </w:tc>
+        <w:tc>
+          <w:tcPr>
+            <w:tcW w:type="dxa" w:w="1502"/>
+            <w:shd w:fill="FFFFFF"/>
+            <w:tcMar>
+              <w:top w:w="80" w:type="dxa"/>
+              <w:bottom w:w="80" w:type="dxa"/>
+              <w:left w:w="80" w:type="dxa"/>
+              <w:right w:w="80" w:type="dxa"/>
+            </w:tcMar>
+          </w:tcPr>
+          <w:p>
+            <w:r>
+              <w:rPr>
+                <w:color w:val="4B5563"/>
+                <w:sz w:val="16"/>
+              </w:rPr>
+              <w:t>Full-body garment display mannequin</w:t>
+            </w:r>
+          </w:p>
+        </w:tc>
+        <w:tc>
+          <w:tcPr>
+            <w:tcW w:type="dxa" w:w="1502"/>
+            <w:shd w:fill="FFFFFF"/>
+            <w:tcMar>
+              <w:top w:w="80" w:type="dxa"/>
+              <w:bottom w:w="80" w:type="dxa"/>
+              <w:left w:w="80" w:type="dxa"/>
+              <w:right w:w="80" w:type="dxa"/>
+            </w:tcMar>
+          </w:tcPr>
+          <w:p>
+            <w:pPr>
+              <w:jc w:val="right"/>
+            </w:pPr>
+            <w:r>
+              <w:rPr>
+                <w:b/>
+                <w:color w:val="111827"/>
+                <w:sz w:val="17"/>
+              </w:rPr>
+              <w:t>₹1,500</w:t>
+            </w:r>
+          </w:p>
+        </w:tc>
+        <w:tc>
+          <w:tcPr>
+            <w:tcW w:type="dxa" w:w="1502"/>
+            <w:shd w:fill="FFFFFF"/>
+            <w:tcMar>
+              <w:top w:w="80" w:type="dxa"/>
+              <w:bottom w:w="80" w:type="dxa"/>
+              <w:left w:w="80" w:type="dxa"/>
+              <w:right w:w="80" w:type="dxa"/>
+            </w:tcMar>
+          </w:tcPr>
+          <w:p>
+            <w:pPr>
+              <w:jc w:val="right"/>
+            </w:pPr>
+            <w:r>
+              <w:rPr>
+                <w:sz w:val="16"/>
+              </w:rPr>
+              <w:t>$16</w:t>
+            </w:r>
+          </w:p>
+        </w:tc>
+        <w:tc>
+          <w:tcPr>
+            <w:tcW w:type="dxa" w:w="1502"/>
+            <w:shd w:fill="FFFFFF"/>
+            <w:tcMar>
+              <w:top w:w="80" w:type="dxa"/>
+              <w:bottom w:w="80" w:type="dxa"/>
+              <w:left w:w="80" w:type="dxa"/>
+              <w:right w:w="80" w:type="dxa"/>
+            </w:tcMar>
+          </w:tcPr>
+          <w:p>
+            <w:pPr>
+              <w:jc w:val="center"/>
+            </w:pPr>
+            <w:r>
+              <w:rPr>
+                <w:sz w:val="16"/>
+              </w:rPr>
+              <w:t>Per day</w:t>
+            </w:r>
+          </w:p>
+        </w:tc>
+        <w:tc>
+          <w:tcPr>
+            <w:tcW w:type="dxa" w:w="1502"/>
+            <w:shd w:fill="FFFFFF"/>
+            <w:tcMar>
+              <w:top w:w="80" w:type="dxa"/>
+              <w:bottom w:w="80" w:type="dxa"/>
+              <w:left w:w="80" w:type="dxa"/>
+              <w:right w:w="80" w:type="dxa"/>
+            </w:tcMar>
+          </w:tcPr>
+          <w:p>
+            <w:pPr>
+              <w:jc w:val="center"/>
+            </w:pPr>
+            <w:r>
+              <w:rPr>
+                <w:color w:val="9CA3AF"/>
+                <w:sz w:val="16"/>
+              </w:rPr>
+              <w:t>[   ] Qty</w:t>
+            </w:r>
+          </w:p>
+        </w:tc>
+      </w:tr>
+      <w:tr>
+        <w:tc>
+          <w:tcPr>
+            <w:tcW w:type="dxa" w:w="1502"/>
+            <w:shd w:fill="F9FAFB"/>
+            <w:tcMar>
+              <w:top w:w="80" w:type="dxa"/>
+              <w:bottom w:w="80" w:type="dxa"/>
+              <w:left w:w="80" w:type="dxa"/>
+              <w:right w:w="80" w:type="dxa"/>
+            </w:tcMar>
+          </w:tcPr>
+          <w:p>
+            <w:pPr>
+              <w:jc w:val="center"/>
+            </w:pPr>
+            <w:r>
+              <w:rPr>
+                <w:b/>
+                <w:color w:val="B45309"/>
+                <w:sz w:val="17"/>
+              </w:rPr>
+              <w:t>DP 29</w:t>
+            </w:r>
+          </w:p>
+        </w:tc>
+        <w:tc>
+          <w:tcPr>
+            <w:tcW w:type="dxa" w:w="1502"/>
+            <w:shd w:fill="F9FAFB"/>
+            <w:tcMar>
+              <w:top w:w="80" w:type="dxa"/>
+              <w:bottom w:w="80" w:type="dxa"/>
+              <w:left w:w="80" w:type="dxa"/>
+              <w:right w:w="80" w:type="dxa"/>
+            </w:tcMar>
+          </w:tcPr>
+          <w:p>
+            <w:r>
+              <w:rPr>
+                <w:b/>
+                <w:sz w:val="17"/>
+              </w:rPr>
+              <w:t>Receptionist</w:t>
+            </w:r>
+          </w:p>
+        </w:tc>
+        <w:tc>
+          <w:tcPr>
+            <w:tcW w:type="dxa" w:w="1502"/>
+            <w:shd w:fill="F9FAFB"/>
+            <w:tcMar>
+              <w:top w:w="80" w:type="dxa"/>
+              <w:bottom w:w="80" w:type="dxa"/>
+              <w:left w:w="80" w:type="dxa"/>
+              <w:right w:w="80" w:type="dxa"/>
+            </w:tcMar>
+          </w:tcPr>
+          <w:p>
+            <w:r>
+              <w:rPr>
+                <w:color w:val="4B5563"/>
+                <w:sz w:val="16"/>
+              </w:rPr>
+              <w:t>Professional stall receptionist / hostess</w:t>
+            </w:r>
+          </w:p>
+        </w:tc>
+        <w:tc>
+          <w:tcPr>
+            <w:tcW w:type="dxa" w:w="1502"/>
+            <w:shd w:fill="F9FAFB"/>
+            <w:tcMar>
+              <w:top w:w="80" w:type="dxa"/>
+              <w:bottom w:w="80" w:type="dxa"/>
+              <w:left w:w="80" w:type="dxa"/>
+              <w:right w:w="80" w:type="dxa"/>
+            </w:tcMar>
+          </w:tcPr>
+          <w:p>
+            <w:pPr>
+              <w:jc w:val="right"/>
+            </w:pPr>
+            <w:r>
+              <w:rPr>
+                <w:b/>
+                <w:color w:val="111827"/>
+                <w:sz w:val="17"/>
+              </w:rPr>
+              <w:t>₹1,000</w:t>
+            </w:r>
+          </w:p>
+        </w:tc>
+        <w:tc>
+          <w:tcPr>
+            <w:tcW w:type="dxa" w:w="1502"/>
+            <w:shd w:fill="F9FAFB"/>
+            <w:tcMar>
+              <w:top w:w="80" w:type="dxa"/>
+              <w:bottom w:w="80" w:type="dxa"/>
+              <w:left w:w="80" w:type="dxa"/>
+              <w:right w:w="80" w:type="dxa"/>
+            </w:tcMar>
+          </w:tcPr>
+          <w:p>
+            <w:pPr>
+              <w:jc w:val="right"/>
+            </w:pPr>
+            <w:r>
+              <w:rPr>
+                <w:sz w:val="16"/>
+              </w:rPr>
+              <w:t>$12</w:t>
+            </w:r>
+          </w:p>
+        </w:tc>
+        <w:tc>
+          <w:tcPr>
+            <w:tcW w:type="dxa" w:w="1502"/>
+            <w:shd w:fill="F9FAFB"/>
+            <w:tcMar>
+              <w:top w:w="80" w:type="dxa"/>
+              <w:bottom w:w="80" w:type="dxa"/>
+              <w:left w:w="80" w:type="dxa"/>
+              <w:right w:w="80" w:type="dxa"/>
+            </w:tcMar>
+          </w:tcPr>
+          <w:p>
+            <w:pPr>
+              <w:jc w:val="center"/>
+            </w:pPr>
+            <w:r>
+              <w:rPr>
+                <w:sz w:val="16"/>
+              </w:rPr>
+              <w:t>Per day</w:t>
+            </w:r>
+          </w:p>
+        </w:tc>
+        <w:tc>
+          <w:tcPr>
+            <w:tcW w:type="dxa" w:w="1502"/>
+            <w:shd w:fill="F9FAFB"/>
             <w:tcMar>
               <w:top w:w="80" w:type="dxa"/>
               <w:bottom w:w="80" w:type="dxa"/>

</xml_diff>